<commit_message>
Regenerate results from two new runs and update verification
</commit_message>
<xml_diff>
--- a/reports/executive-brief.docx
+++ b/reports/executive-brief.docx
@@ -96,14 +96,14 @@
           <w:b w:val="0"/>
           <w:color w:val="0B0B0B"/>
         </w:rPr>
-        <w:t xml:space="preserve">: one wave of 1,690 customers (24% of the 7,043-customer base), with half held out as a control group. Scale up only if the measured save rate clears the </w:t>
+        <w:t xml:space="preserve"> on the recommended list: one wave of 1,550 customers (22% of the 7,043-customer base), half held out as a control group. Scale up only if the measured save rate clears that list's </w:t>
       </w:r>
       <w:r>
         <w:rPr>
           <w:b/>
           <w:color w:val="0B0B0B"/>
         </w:rPr>
-        <w:t>11.8% break-even</w:t>
+        <w:t>13.9% break-even</w:t>
       </w:r>
       <w:r>
         <w:rPr>
@@ -775,21 +775,21 @@
           <w:b w:val="0"/>
           <w:color w:val="0B0B0B"/>
         </w:rPr>
-        <w:t xml:space="preserve">Each extra budget step returns less (figure). We keep only the steps that still earn at least a 10% marginal return; this was decided on validation data. That rule recommends a budget of </w:t>
+        <w:t xml:space="preserve">Each extra budget step returns less (figure). We keep only the steps that still earn at least a 10% marginal return; this was decided on validation data. That rule recommends </w:t>
       </w:r>
       <w:r>
         <w:rPr>
           <w:b/>
           <w:color w:val="0B0B0B"/>
         </w:rPr>
-        <w:t>24% of the base</w:t>
+        <w:t>$6.00 per customer in the base</w:t>
       </w:r>
       <w:r>
         <w:rPr>
           <w:b w:val="0"/>
           <w:color w:val="0B0B0B"/>
         </w:rPr>
-        <w:t>. On the test customers this means 310 offers for $8,450, an expected net value of $3,692 (ROI 44%). Above about 27% of the base, no remaining customer has positive expected value, so further budget should not be spent.</w:t>
+        <w:t xml:space="preserve"> (enough for the standard offer to 24% of customers; about $42,238 for all 7,043). On the test customers this buys 310 offers (22% of customers) for $8,450, an expected net value of $3,692 (ROI 44%). Beyond 27% of customers contacted, nobody left has positive expected value, so further budget should not be spent.</w:t>
       </w:r>
     </w:p>
     <w:p>
@@ -856,7 +856,7 @@
           <w:b w:val="0"/>
           <w:color w:val="0B0B0B"/>
         </w:rPr>
-        <w:t xml:space="preserve"> ROC-AUC 0.83, PR-AUC 0.62 (random contact: 0.27). Probabilities are off by 2.0% on average. It predicts who leaves, not who an offer would keep.</w:t>
+        <w:t xml:space="preserve"> ROC-AUC 0.83, PR-AUC 0.62 (random contact: 0.27). Predicted churn is within 2.0 percentage points of observed churn on average. It predicts who leaves, not who an offer would keep.</w:t>
       </w:r>
     </w:p>
     <w:p>
@@ -876,7 +876,7 @@
           <w:b w:val="0"/>
           <w:color w:val="0B0B0B"/>
         </w:rPr>
-        <w:t xml:space="preserve"> the plan stays profitable while the true save rate is above </w:t>
+        <w:t xml:space="preserve"> the base-budget list stays profitable while the true save rate is above </w:t>
       </w:r>
       <w:r>
         <w:rPr>
@@ -884,6 +884,20 @@
           <w:color w:val="0B0B0B"/>
         </w:rPr>
         <w:t>11.8%</w:t>
+      </w:r>
+      <w:r>
+        <w:rPr>
+          <w:b w:val="0"/>
+          <w:color w:val="0B0B0B"/>
+        </w:rPr>
+        <w:t xml:space="preserve">, the larger recommended list above </w:t>
+      </w:r>
+      <w:r>
+        <w:rPr>
+          <w:b/>
+          <w:color w:val="0B0B0B"/>
+        </w:rPr>
+        <w:t>13.9%</w:t>
       </w:r>
       <w:r>
         <w:rPr>
@@ -1039,7 +1053,7 @@
           <w:b w:val="0"/>
           <w:color w:val="0B0B0B"/>
         </w:rPr>
-        <w:t>Approve one pilot wave: 845 customers contacted and 845 held out. Offer and contact budget about $23,033.</w:t>
+        <w:t>Approve one pilot wave: 775 customers contacted and 775 held out. Offer and contact budget about $21,125.</w:t>
       </w:r>
     </w:p>
     <w:p>
@@ -1065,7 +1079,35 @@
           <w:b w:val="0"/>
           <w:color w:val="0B0B0B"/>
         </w:rPr>
-        <w:t>Agree the go/no-go rule now. Scale to 24% of the base only if, after 90 days, the lower 95% bound of the measured save rate is above 11.8%.</w:t>
+        <w:t xml:space="preserve">Agree the decision rule now. After 90 days: </w:t>
+      </w:r>
+      <w:r>
+        <w:rPr>
+          <w:b/>
+          <w:color w:val="0B0B0B"/>
+        </w:rPr>
+        <w:t>go</w:t>
+      </w:r>
+      <w:r>
+        <w:rPr>
+          <w:b w:val="0"/>
+          <w:color w:val="0B0B0B"/>
+        </w:rPr>
+        <w:t xml:space="preserve"> (scale to the recommended budget) if the offer effect is statistically significant and the measured save rate is at least 13.9%; </w:t>
+      </w:r>
+      <w:r>
+        <w:rPr>
+          <w:b/>
+          <w:color w:val="0B0B0B"/>
+        </w:rPr>
+        <w:t>stop</w:t>
+      </w:r>
+      <w:r>
+        <w:rPr>
+          <w:b w:val="0"/>
+          <w:color w:val="0B0B0B"/>
+        </w:rPr>
+        <w:t xml:space="preserve"> if it is clearly below; otherwise run one more wave. If the true save rate is 20%, this rule says go 94% of the time.</w:t>
       </w:r>
     </w:p>
     <w:sectPr>

</xml_diff>

<commit_message>
Regenerate results from two final runs and record verification
Runs A and B use the final code and configuration; older runs are
pruned. Reports, notebooks, figures, the two-page brief, the 14-slide
deck and dashboard screenshots come from run B. Tests, notebook,
release and browser checks pass; the verification record and change
log describe the 2.1.0 release.
</commit_message>
<xml_diff>
--- a/reports/executive-brief.docx
+++ b/reports/executive-brief.docx
@@ -14,6 +14,7 @@
       <w:r>
         <w:rPr>
           <w:b/>
+          <w:i w:val="0"/>
           <w:color w:val="0B0B0B"/>
         </w:rPr>
         <w:t>To:</w:t>
@@ -21,6 +22,7 @@
       <w:r>
         <w:rPr>
           <w:b w:val="0"/>
+          <w:i w:val="0"/>
           <w:color w:val="0B0B0B"/>
         </w:rPr>
         <w:t xml:space="preserve"> Head of Customer Retention | </w:t>
@@ -28,6 +30,7 @@
       <w:r>
         <w:rPr>
           <w:b/>
+          <w:i w:val="0"/>
           <w:color w:val="0B0B0B"/>
         </w:rPr>
         <w:t>From:</w:t>
@@ -35,6 +38,7 @@
       <w:r>
         <w:rPr>
           <w:b w:val="0"/>
+          <w:i w:val="0"/>
           <w:color w:val="0B0B0B"/>
         </w:rPr>
         <w:t xml:space="preserve"> Retention analytics team | </w:t>
@@ -42,6 +46,7 @@
       <w:r>
         <w:rPr>
           <w:b/>
+          <w:i w:val="0"/>
           <w:color w:val="0B0B0B"/>
         </w:rPr>
         <w:t>Decision requested:</w:t>
@@ -49,9 +54,44 @@
       <w:r>
         <w:rPr>
           <w:b w:val="0"/>
+          <w:i w:val="0"/>
           <w:color w:val="0B0B0B"/>
         </w:rPr>
         <w:t xml:space="preserve"> approve a 90-day retention pilot</w:t>
+      </w:r>
+    </w:p>
+    <w:p>
+      <w:r>
+        <w:rPr>
+          <w:b/>
+          <w:i w:val="0"/>
+          <w:color w:val="0B0B0B"/>
+        </w:rPr>
+        <w:t>The issue.</w:t>
+      </w:r>
+      <w:r>
+        <w:rPr>
+          <w:b w:val="0"/>
+          <w:i w:val="0"/>
+          <w:color w:val="0B0B0B"/>
+        </w:rPr>
+        <w:t xml:space="preserve"> Churn puts about </w:t>
+      </w:r>
+      <w:r>
+        <w:rPr>
+          <w:b/>
+          <w:i w:val="0"/>
+          <w:color w:val="0B0B0B"/>
+        </w:rPr>
+        <w:t>$468,468</w:t>
+      </w:r>
+      <w:r>
+        <w:rPr>
+          <w:b w:val="0"/>
+          <w:i w:val="0"/>
+          <w:color w:val="0B0B0B"/>
+        </w:rPr>
+        <w:t xml:space="preserve"> of 12-month customer margin at risk across the 7,043 customers of the sample company (IBM's fictional US telco; USD). Today's rule spends the budget on the customers most likely to leave, ignoring what they are worth and what an offer costs.</w:t>
       </w:r>
     </w:p>
     <w:p>
@@ -63,51 +103,150 @@
       </w:r>
     </w:p>
     <w:p>
+      <w:pPr>
+        <w:tabs>
+          <w:tab w:pos="357" w:val="left"/>
+        </w:tabs>
+        <w:spacing w:after="20"/>
+        <w:ind w:left="357" w:hanging="357"/>
+      </w:pPr>
       <w:r>
         <w:rPr>
           <w:b w:val="0"/>
+          <w:i w:val="0"/>
           <w:color w:val="0B0B0B"/>
         </w:rPr>
-        <w:t xml:space="preserve">Stop allocating the retention budget to "the customers most likely to leave". Allocate it to the customers for whom </w:t>
+        <w:t>1.</w:t>
+        <w:tab/>
       </w:r>
       <w:r>
         <w:rPr>
           <w:b/>
+          <w:i w:val="0"/>
           <w:color w:val="0B0B0B"/>
         </w:rPr>
-        <w:t>churn risk x customer value x the offer's save rate</w:t>
+        <w:t>Target by expected value, not by risk alone.</w:t>
       </w:r>
       <w:r>
         <w:rPr>
           <w:b w:val="0"/>
+          <w:i w:val="0"/>
           <w:color w:val="0B0B0B"/>
         </w:rPr>
-        <w:t xml:space="preserve"> most exceeds the cost of the offer, and give each customer an offer their segment qualifies for. Start with a </w:t>
+        <w:t xml:space="preserve"> Make an offer only where churn risk x customer value x the offer's </w:t>
+      </w:r>
+      <w:r>
+        <w:rPr>
+          <w:b w:val="0"/>
+          <w:i/>
+          <w:color w:val="0B0B0B"/>
+        </w:rPr>
+        <w:t>save rate</w:t>
+      </w:r>
+      <w:r>
+        <w:rPr>
+          <w:b w:val="0"/>
+          <w:i w:val="0"/>
+          <w:color w:val="0B0B0B"/>
+        </w:rPr>
+        <w:t xml:space="preserve"> (the share of would-be leavers it keeps) exceeds its cost. Here that means </w:t>
       </w:r>
       <w:r>
         <w:rPr>
           <w:b/>
+          <w:i w:val="0"/>
           <w:color w:val="0B0B0B"/>
         </w:rPr>
-        <w:t>randomised pilot</w:t>
+        <w:t>fibre customers on month-to-month contracts with high bills</w:t>
       </w:r>
       <w:r>
         <w:rPr>
           <w:b w:val="0"/>
+          <w:i w:val="0"/>
           <w:color w:val="0B0B0B"/>
         </w:rPr>
-        <w:t xml:space="preserve"> on the recommended list: one wave of 1,550 customers (22% of the 7,043-customer base), half held out as a control group. Scale up only if the measured save rate clears that list's </w:t>
+        <w:t>: 100% of the recommended list have fibre and 97% a monthly contract, with a median bill of $89 against $70 overall. Low-risk and low-bill customers are left out.</w:t>
+      </w:r>
+    </w:p>
+    <w:p>
+      <w:pPr>
+        <w:tabs>
+          <w:tab w:pos="357" w:val="left"/>
+        </w:tabs>
+        <w:spacing w:after="20"/>
+        <w:ind w:left="357" w:hanging="357"/>
+      </w:pPr>
+      <w:r>
+        <w:rPr>
+          <w:b w:val="0"/>
+          <w:i w:val="0"/>
+          <w:color w:val="0B0B0B"/>
+        </w:rPr>
+        <w:t>2.</w:t>
+        <w:tab/>
       </w:r>
       <w:r>
         <w:rPr>
           <w:b/>
+          <w:i w:val="0"/>
           <w:color w:val="0B0B0B"/>
         </w:rPr>
-        <w:t>13.9% break-even</w:t>
+        <w:t>Match the offer to the segment:</w:t>
       </w:r>
       <w:r>
         <w:rPr>
           <w:b w:val="0"/>
+          <w:i w:val="0"/>
+          <w:color w:val="0B0B0B"/>
+        </w:rPr>
+        <w:t xml:space="preserve"> $35 credit for moving to a 1-year contract (150), 6 months free TechSupport + OnlineSecurity (150), One-time $20 bill credit (24).</w:t>
+      </w:r>
+    </w:p>
+    <w:p>
+      <w:pPr>
+        <w:tabs>
+          <w:tab w:pos="357" w:val="left"/>
+        </w:tabs>
+        <w:spacing w:after="20"/>
+        <w:ind w:left="357" w:hanging="357"/>
+      </w:pPr>
+      <w:r>
+        <w:rPr>
+          <w:b w:val="0"/>
+          <w:i w:val="0"/>
+          <w:color w:val="0B0B0B"/>
+        </w:rPr>
+        <w:t>3.</w:t>
+        <w:tab/>
+      </w:r>
+      <w:r>
+        <w:rPr>
+          <w:b/>
+          <w:i w:val="0"/>
+          <w:color w:val="0B0B0B"/>
+        </w:rPr>
+        <w:t>Test before scaling:</w:t>
+      </w:r>
+      <w:r>
+        <w:rPr>
+          <w:b w:val="0"/>
+          <w:i w:val="0"/>
+          <w:color w:val="0B0B0B"/>
+        </w:rPr>
+        <w:t xml:space="preserve"> one randomised pilot wave of 1,620 customers, half held out, and scale up only if the measured save rate clears that list's </w:t>
+      </w:r>
+      <w:r>
+        <w:rPr>
+          <w:b/>
+          <w:i w:val="0"/>
+          <w:color w:val="0B0B0B"/>
+        </w:rPr>
+        <w:t>13.8% break-even</w:t>
+      </w:r>
+      <w:r>
+        <w:rPr>
+          <w:b w:val="0"/>
+          <w:i w:val="0"/>
           <w:color w:val="0B0B0B"/>
         </w:rPr>
         <w:t>.</w:t>
@@ -125,9 +264,10 @@
       <w:r>
         <w:rPr>
           <w:b w:val="0"/>
+          <w:i w:val="0"/>
           <w:color w:val="0B0B0B"/>
         </w:rPr>
-        <w:t>Results for 1,409 held-out customers with a fixed $3,500 budget (enough to offer 10% of them the standard offer):</w:t>
+        <w:t>1,409 test customers (held out from every choice), fixed $3,500 budget:</w:t>
       </w:r>
     </w:p>
     <w:tbl>
@@ -155,6 +295,7 @@
             <w:r>
               <w:rPr>
                 <w:b/>
+                <w:i w:val="0"/>
                 <w:color w:val="0B0B0B"/>
                 <w:sz w:val="18"/>
               </w:rPr>
@@ -171,6 +312,7 @@
             <w:r>
               <w:rPr>
                 <w:b/>
+                <w:i w:val="0"/>
                 <w:color w:val="0B0B0B"/>
                 <w:sz w:val="18"/>
               </w:rPr>
@@ -187,6 +329,7 @@
             <w:r>
               <w:rPr>
                 <w:b/>
+                <w:i w:val="0"/>
                 <w:color w:val="0B0B0B"/>
                 <w:sz w:val="18"/>
               </w:rPr>
@@ -203,6 +346,7 @@
             <w:r>
               <w:rPr>
                 <w:b/>
+                <w:i w:val="0"/>
                 <w:color w:val="0B0B0B"/>
                 <w:sz w:val="18"/>
               </w:rPr>
@@ -219,6 +363,7 @@
             <w:r>
               <w:rPr>
                 <w:b/>
+                <w:i w:val="0"/>
                 <w:color w:val="0B0B0B"/>
                 <w:sz w:val="18"/>
               </w:rPr>
@@ -235,6 +380,7 @@
             <w:r>
               <w:rPr>
                 <w:b/>
+                <w:i w:val="0"/>
                 <w:color w:val="0B0B0B"/>
                 <w:sz w:val="18"/>
               </w:rPr>
@@ -253,6 +399,7 @@
             <w:r>
               <w:rPr>
                 <w:b w:val="0"/>
+                <w:i w:val="0"/>
                 <w:color w:val="0B0B0B"/>
                 <w:sz w:val="18"/>
               </w:rPr>
@@ -272,6 +419,7 @@
             <w:r>
               <w:rPr>
                 <w:b w:val="0"/>
+                <w:i w:val="0"/>
                 <w:color w:val="0B0B0B"/>
                 <w:sz w:val="18"/>
               </w:rPr>
@@ -291,6 +439,7 @@
             <w:r>
               <w:rPr>
                 <w:b w:val="0"/>
+                <w:i w:val="0"/>
                 <w:color w:val="0B0B0B"/>
                 <w:sz w:val="18"/>
               </w:rPr>
@@ -310,6 +459,7 @@
             <w:r>
               <w:rPr>
                 <w:b w:val="0"/>
+                <w:i w:val="0"/>
                 <w:color w:val="0B0B0B"/>
                 <w:sz w:val="18"/>
               </w:rPr>
@@ -329,6 +479,7 @@
             <w:r>
               <w:rPr>
                 <w:b w:val="0"/>
+                <w:i w:val="0"/>
                 <w:color w:val="0B0B0B"/>
                 <w:sz w:val="18"/>
               </w:rPr>
@@ -348,10 +499,11 @@
             <w:r>
               <w:rPr>
                 <w:b w:val="0"/>
+                <w:i w:val="0"/>
                 <w:color w:val="0B0B0B"/>
                 <w:sz w:val="18"/>
               </w:rPr>
-              <w:t>0.0%</w:t>
+              <w:t>0%</w:t>
             </w:r>
           </w:p>
         </w:tc>
@@ -366,10 +518,11 @@
             <w:r>
               <w:rPr>
                 <w:b w:val="0"/>
+                <w:i w:val="0"/>
                 <w:color w:val="0B0B0B"/>
                 <w:sz w:val="18"/>
               </w:rPr>
-              <w:t>Call highest churn risk</w:t>
+              <w:t>Call highest churn risk (today)</w:t>
             </w:r>
           </w:p>
         </w:tc>
@@ -385,6 +538,7 @@
             <w:r>
               <w:rPr>
                 <w:b w:val="0"/>
+                <w:i w:val="0"/>
                 <w:color w:val="0B0B0B"/>
                 <w:sz w:val="18"/>
               </w:rPr>
@@ -404,10 +558,11 @@
             <w:r>
               <w:rPr>
                 <w:b w:val="0"/>
+                <w:i w:val="0"/>
                 <w:color w:val="0B0B0B"/>
                 <w:sz w:val="18"/>
               </w:rPr>
-              <w:t>$1,098</w:t>
+              <w:t>$1,301</w:t>
             </w:r>
           </w:p>
         </w:tc>
@@ -423,10 +578,11 @@
             <w:r>
               <w:rPr>
                 <w:b w:val="0"/>
+                <w:i w:val="0"/>
                 <w:color w:val="0B0B0B"/>
                 <w:sz w:val="18"/>
               </w:rPr>
-              <w:t>31%</w:t>
+              <w:t>37%</w:t>
             </w:r>
           </w:p>
         </w:tc>
@@ -442,10 +598,11 @@
             <w:r>
               <w:rPr>
                 <w:b w:val="0"/>
+                <w:i w:val="0"/>
                 <w:color w:val="0B0B0B"/>
                 <w:sz w:val="18"/>
               </w:rPr>
-              <w:t>70.0%</w:t>
+              <w:t>71%</w:t>
             </w:r>
           </w:p>
         </w:tc>
@@ -461,10 +618,11 @@
             <w:r>
               <w:rPr>
                 <w:b w:val="0"/>
+                <w:i w:val="0"/>
                 <w:color w:val="0B0B0B"/>
                 <w:sz w:val="18"/>
               </w:rPr>
-              <w:t>3.9%</w:t>
+              <w:t>12%</w:t>
             </w:r>
           </w:p>
         </w:tc>
@@ -479,10 +637,11 @@
             <w:r>
               <w:rPr>
                 <w:b w:val="0"/>
+                <w:i w:val="0"/>
                 <w:color w:val="0B0B0B"/>
                 <w:sz w:val="18"/>
               </w:rPr>
-              <w:t>Expected value, standard offer</w:t>
+              <w:t>Call highest value</w:t>
             </w:r>
           </w:p>
         </w:tc>
@@ -498,6 +657,7 @@
             <w:r>
               <w:rPr>
                 <w:b w:val="0"/>
+                <w:i w:val="0"/>
                 <w:color w:val="0B0B0B"/>
                 <w:sz w:val="18"/>
               </w:rPr>
@@ -517,10 +677,11 @@
             <w:r>
               <w:rPr>
                 <w:b w:val="0"/>
+                <w:i w:val="0"/>
                 <w:color w:val="0B0B0B"/>
                 <w:sz w:val="18"/>
               </w:rPr>
-              <w:t>$2,130</w:t>
+              <w:t>-$1,037</w:t>
             </w:r>
           </w:p>
         </w:tc>
@@ -536,10 +697,11 @@
             <w:r>
               <w:rPr>
                 <w:b w:val="0"/>
+                <w:i w:val="0"/>
                 <w:color w:val="0B0B0B"/>
                 <w:sz w:val="18"/>
               </w:rPr>
-              <w:t>61%</w:t>
+              <w:t>-30%</w:t>
             </w:r>
           </w:p>
         </w:tc>
@@ -555,10 +717,11 @@
             <w:r>
               <w:rPr>
                 <w:b w:val="0"/>
+                <w:i w:val="0"/>
                 <w:color w:val="0B0B0B"/>
                 <w:sz w:val="18"/>
               </w:rPr>
-              <w:t>62.1%</w:t>
+              <w:t>29%</w:t>
             </w:r>
           </w:p>
         </w:tc>
@@ -574,10 +737,130 @@
             <w:r>
               <w:rPr>
                 <w:b w:val="0"/>
+                <w:i w:val="0"/>
                 <w:color w:val="0B0B0B"/>
                 <w:sz w:val="18"/>
               </w:rPr>
-              <w:t>96.1%</w:t>
+              <w:t>30%</w:t>
+            </w:r>
+          </w:p>
+        </w:tc>
+      </w:tr>
+      <w:tr>
+        <w:tc>
+          <w:tcPr>
+            <w:tcW w:type="dxa" w:w="1625"/>
+          </w:tcPr>
+          <w:p>
+            <w:r/>
+            <w:r>
+              <w:rPr>
+                <w:b w:val="0"/>
+                <w:i w:val="0"/>
+                <w:color w:val="0B0B0B"/>
+                <w:sz w:val="18"/>
+              </w:rPr>
+              <w:t>Expected value, one standard offer</w:t>
+            </w:r>
+          </w:p>
+        </w:tc>
+        <w:tc>
+          <w:tcPr>
+            <w:tcW w:type="dxa" w:w="1625"/>
+          </w:tcPr>
+          <w:p>
+            <w:pPr>
+              <w:jc w:val="right"/>
+            </w:pPr>
+            <w:r/>
+            <w:r>
+              <w:rPr>
+                <w:b w:val="0"/>
+                <w:i w:val="0"/>
+                <w:color w:val="0B0B0B"/>
+                <w:sz w:val="18"/>
+              </w:rPr>
+              <w:t>140</w:t>
+            </w:r>
+          </w:p>
+        </w:tc>
+        <w:tc>
+          <w:tcPr>
+            <w:tcW w:type="dxa" w:w="1625"/>
+          </w:tcPr>
+          <w:p>
+            <w:pPr>
+              <w:jc w:val="right"/>
+            </w:pPr>
+            <w:r/>
+            <w:r>
+              <w:rPr>
+                <w:b w:val="0"/>
+                <w:i w:val="0"/>
+                <w:color w:val="0B0B0B"/>
+                <w:sz w:val="18"/>
+              </w:rPr>
+              <w:t>$2,340</w:t>
+            </w:r>
+          </w:p>
+        </w:tc>
+        <w:tc>
+          <w:tcPr>
+            <w:tcW w:type="dxa" w:w="1625"/>
+          </w:tcPr>
+          <w:p>
+            <w:pPr>
+              <w:jc w:val="right"/>
+            </w:pPr>
+            <w:r/>
+            <w:r>
+              <w:rPr>
+                <w:b w:val="0"/>
+                <w:i w:val="0"/>
+                <w:color w:val="0B0B0B"/>
+                <w:sz w:val="18"/>
+              </w:rPr>
+              <w:t>67%</w:t>
+            </w:r>
+          </w:p>
+        </w:tc>
+        <w:tc>
+          <w:tcPr>
+            <w:tcW w:type="dxa" w:w="1625"/>
+          </w:tcPr>
+          <w:p>
+            <w:pPr>
+              <w:jc w:val="right"/>
+            </w:pPr>
+            <w:r/>
+            <w:r>
+              <w:rPr>
+                <w:b w:val="0"/>
+                <w:i w:val="0"/>
+                <w:color w:val="0B0B0B"/>
+                <w:sz w:val="18"/>
+              </w:rPr>
+              <w:t>60%</w:t>
+            </w:r>
+          </w:p>
+        </w:tc>
+        <w:tc>
+          <w:tcPr>
+            <w:tcW w:type="dxa" w:w="1625"/>
+          </w:tcPr>
+          <w:p>
+            <w:pPr>
+              <w:jc w:val="right"/>
+            </w:pPr>
+            <w:r/>
+            <w:r>
+              <w:rPr>
+                <w:b w:val="0"/>
+                <w:i w:val="0"/>
+                <w:color w:val="0B0B0B"/>
+                <w:sz w:val="18"/>
+              </w:rPr>
+              <w:t>96%</w:t>
             </w:r>
           </w:p>
         </w:tc>
@@ -592,10 +875,11 @@
             <w:r>
               <w:rPr>
                 <w:b/>
+                <w:i w:val="0"/>
                 <w:color w:val="0B0B0B"/>
                 <w:sz w:val="18"/>
               </w:rPr>
-              <w:t>Expected value + segment offers</w:t>
+              <w:t>Expected value + segment offers (recommended)</w:t>
             </w:r>
           </w:p>
         </w:tc>
@@ -611,10 +895,11 @@
             <w:r>
               <w:rPr>
                 <w:b/>
+                <w:i w:val="0"/>
                 <w:color w:val="0B0B0B"/>
                 <w:sz w:val="18"/>
               </w:rPr>
-              <w:t>152</w:t>
+              <w:t>153</w:t>
             </w:r>
           </w:p>
         </w:tc>
@@ -630,10 +915,11 @@
             <w:r>
               <w:rPr>
                 <w:b/>
+                <w:i w:val="0"/>
                 <w:color w:val="0B0B0B"/>
                 <w:sz w:val="18"/>
               </w:rPr>
-              <w:t>$2,420</w:t>
+              <w:t>$2,668</w:t>
             </w:r>
           </w:p>
         </w:tc>
@@ -649,10 +935,11 @@
             <w:r>
               <w:rPr>
                 <w:b/>
+                <w:i w:val="0"/>
                 <w:color w:val="0B0B0B"/>
                 <w:sz w:val="18"/>
               </w:rPr>
-              <w:t>69%</w:t>
+              <w:t>76%</w:t>
             </w:r>
           </w:p>
         </w:tc>
@@ -668,10 +955,11 @@
             <w:r>
               <w:rPr>
                 <w:b/>
+                <w:i w:val="0"/>
                 <w:color w:val="0B0B0B"/>
                 <w:sz w:val="18"/>
               </w:rPr>
-              <w:t>59.9%</w:t>
+              <w:t>60%</w:t>
             </w:r>
           </w:p>
         </w:tc>
@@ -687,10 +975,11 @@
             <w:r>
               <w:rPr>
                 <w:b/>
+                <w:i w:val="0"/>
                 <w:color w:val="0B0B0B"/>
                 <w:sz w:val="18"/>
               </w:rPr>
-              <w:t>100.0%</w:t>
+              <w:t>98%</w:t>
             </w:r>
           </w:p>
         </w:tc>
@@ -709,16 +998,18 @@
       <w:r>
         <w:rPr>
           <w:b/>
+          <w:i w:val="0"/>
           <w:color w:val="0B0B0B"/>
         </w:rPr>
-        <w:t>Better targeting earns $1,032 more (94%) for the same spend.</w:t>
+        <w:t>The recommended rule is expected to add $1,368 for the same spend</w:t>
       </w:r>
       <w:r>
         <w:rPr>
           <w:b w:val="0"/>
+          <w:i w:val="0"/>
           <w:color w:val="0B0B0B"/>
         </w:rPr>
-        <w:t xml:space="preserve"> Using what these customers actually did, the gain is $1,308 (95% interval $509 to $2,153).</w:t>
+        <w:t>: $1,039 from choosing customers by expected value and $328 from matching offers. Valued with actual churn (at the assumed save rates), the gain is $1,077 (95% interval $229 to $2,002); the part from matching offers is not proven.</w:t>
       </w:r>
     </w:p>
     <w:p>
@@ -728,37 +1019,11 @@
       </w:pPr>
       <w:r>
         <w:rPr>
-          <w:b/>
+          <w:b w:val="0"/>
+          <w:i w:val="0"/>
           <w:color w:val="0B0B0B"/>
         </w:rPr>
-        <w:t>Why:</w:t>
-      </w:r>
-      <w:r>
-        <w:rPr>
-          <w:b w:val="0"/>
-          <w:color w:val="0B0B0B"/>
-        </w:rPr>
-        <w:t xml:space="preserve"> risk-only targeting spends the budget on high-risk customers whose remaining value is too small to repay an offer. It reaches only 4% of the high-risk, high-value customers, against 100% for the recommended rule. It has higher precision but less value.</w:t>
-      </w:r>
-    </w:p>
-    <w:p>
-      <w:pPr>
-        <w:pStyle w:val="ListBullet"/>
-        <w:spacing w:after="20"/>
-      </w:pPr>
-      <w:r>
-        <w:rPr>
-          <w:b/>
-          <w:color w:val="0B0B0B"/>
-        </w:rPr>
-        <w:t>Segment offers add $290</w:t>
-      </w:r>
-      <w:r>
-        <w:rPr>
-          <w:b w:val="0"/>
-          <w:color w:val="0B0B0B"/>
-        </w:rPr>
-        <w:t xml:space="preserve"> under the assumed save rates. Checked against actual outcomes the gain is not distinguishable from zero (-$27), so the pilot must test the offers, not just the list.</w:t>
+        <w:t>Risk-only is more precise but spends on risky customers whose value cannot repay an offer. Calling the most valuable customers loses money: risk and value are needed together.</w:t>
       </w:r>
     </w:p>
     <w:p>
@@ -773,23 +1038,26 @@
       <w:r>
         <w:rPr>
           <w:b w:val="0"/>
+          <w:i w:val="0"/>
           <w:color w:val="0B0B0B"/>
         </w:rPr>
-        <w:t xml:space="preserve">Each extra budget step returns less (figure). We keep only the steps that still earn at least a 10% marginal return; this was decided on validation data. That rule recommends </w:t>
+        <w:t xml:space="preserve">Each extra budget step returns less (figure). Keeping only steps that still return at least 10% (decided on validation data) gives about </w:t>
       </w:r>
       <w:r>
         <w:rPr>
           <w:b/>
+          <w:i w:val="0"/>
           <w:color w:val="0B0B0B"/>
         </w:rPr>
-        <w:t>$6.00 per customer in the base</w:t>
+        <w:t>$45,737 for the whole base</w:t>
       </w:r>
       <w:r>
         <w:rPr>
           <w:b w:val="0"/>
+          <w:i w:val="0"/>
           <w:color w:val="0B0B0B"/>
         </w:rPr>
-        <w:t xml:space="preserve"> (enough for the standard offer to 24% of customers; about $42,238 for all 7,043). On the test customers this buys 310 offers (22% of customers) for $8,450, an expected net value of $3,692 (ROI 44%). Beyond 27% of customers contacted, nobody left has positive expected value, so further budget should not be spent.</w:t>
+        <w:t xml:space="preserve"> ($6.49 per customer). On the test customers this buys 324 offers for $9,150: expected net value $4,145, ROI 45%. Beyond 26% of customers nobody has positive expected value.</w:t>
       </w:r>
     </w:p>
     <w:p>
@@ -847,16 +1115,18 @@
       <w:r>
         <w:rPr>
           <w:b/>
+          <w:i w:val="0"/>
           <w:color w:val="0B0B0B"/>
         </w:rPr>
-        <w:t>The model ranks customers well:</w:t>
+        <w:t>Who to target is robust.</w:t>
       </w:r>
       <w:r>
         <w:rPr>
           <w:b w:val="0"/>
+          <w:i w:val="0"/>
           <w:color w:val="0B0B0B"/>
         </w:rPr>
-        <w:t xml:space="preserve"> ROC-AUC 0.83, PR-AUC 0.62 (random contact: 0.27). Predicted churn is within 2.0 percentage points of observed churn on average. It predicts who leaves, not who an offer would keep.</w:t>
+        <w:t xml:space="preserve"> The model ranks churners well (ROC-AUC 0.83) and its probabilities are within 1.9 points of observed churn. With all assumptions drawn at once, expected-value targeting beats risk-only in 100% of draws.</w:t>
       </w:r>
     </w:p>
     <w:p>
@@ -867,44 +1137,18 @@
       <w:r>
         <w:rPr>
           <w:b/>
+          <w:i w:val="0"/>
           <w:color w:val="0B0B0B"/>
         </w:rPr>
-        <w:t>Break-even:</w:t>
+        <w:t>How much an offer saves is not.</w:t>
       </w:r>
       <w:r>
         <w:rPr>
           <w:b w:val="0"/>
+          <w:i w:val="0"/>
           <w:color w:val="0B0B0B"/>
         </w:rPr>
-        <w:t xml:space="preserve"> the base-budget list stays profitable while the true save rate is above </w:t>
-      </w:r>
-      <w:r>
-        <w:rPr>
-          <w:b/>
-          <w:color w:val="0B0B0B"/>
-        </w:rPr>
-        <w:t>11.8%</w:t>
-      </w:r>
-      <w:r>
-        <w:rPr>
-          <w:b w:val="0"/>
-          <w:color w:val="0B0B0B"/>
-        </w:rPr>
-        <w:t xml:space="preserve">, the larger recommended list above </w:t>
-      </w:r>
-      <w:r>
-        <w:rPr>
-          <w:b/>
-          <w:color w:val="0B0B0B"/>
-        </w:rPr>
-        <w:t>13.9%</w:t>
-      </w:r>
-      <w:r>
-        <w:rPr>
-          <w:b w:val="0"/>
-          <w:color w:val="0B0B0B"/>
-        </w:rPr>
-        <w:t>; we assume 20%. Below 8.9% nobody is worth contacting.</w:t>
+        <w:t xml:space="preserve"> Lists break even at a save rate of 11.3% (base budget) and 13.8% (recommended); we assume 20%. Only 46% of churners left for price or a competitor's offer, so 20% means keeping 43% of those an offer can reach.</w:t>
       </w:r>
     </w:p>
     <w:p>
@@ -915,36 +1159,18 @@
       <w:r>
         <w:rPr>
           <w:b/>
+          <w:i w:val="0"/>
           <w:color w:val="0B0B0B"/>
         </w:rPr>
-        <w:t>Scenarios:</w:t>
+        <w:t>Downside:</w:t>
       </w:r>
       <w:r>
         <w:rPr>
           <w:b w:val="0"/>
+          <w:i w:val="0"/>
           <w:color w:val="0B0B0B"/>
         </w:rPr>
-        <w:t xml:space="preserve"> expected net value is $0 pessimistic (no campaign is run), $2,420 base and $18,525 optimistic. A list frozen under the pessimistic case would lose $2,797.</w:t>
-      </w:r>
-    </w:p>
-    <w:p>
-      <w:pPr>
-        <w:pStyle w:val="ListBullet"/>
-        <w:spacing w:after="20"/>
-      </w:pPr>
-      <w:r>
-        <w:rPr>
-          <w:b/>
-          <w:color w:val="0B0B0B"/>
-        </w:rPr>
-        <w:t>Biggest uncertainties:</w:t>
-      </w:r>
-      <w:r>
-        <w:rPr>
-          <w:b w:val="0"/>
-          <w:color w:val="0B0B0B"/>
-        </w:rPr>
-        <w:t xml:space="preserve"> save rate of the standard offer and value horizon (months).</w:t>
+        <w:t xml:space="preserve"> the recommended list loses money in 17% of draws, and in the worst 5% it loses more than $12,217 across the base; the smaller base-budget list loses in 9%.</w:t>
       </w:r>
     </w:p>
     <w:p>
@@ -963,6 +1189,7 @@
       <w:r>
         <w:rPr>
           <w:b/>
+          <w:i w:val="0"/>
           <w:color w:val="0B0B0B"/>
         </w:rPr>
         <w:t>No causal evidence yet.</w:t>
@@ -970,9 +1197,10 @@
       <w:r>
         <w:rPr>
           <w:b w:val="0"/>
+          <w:i w:val="0"/>
           <w:color w:val="0B0B0B"/>
         </w:rPr>
-        <w:t xml:space="preserve"> Save rates are documented assumptions. Contacting customers can even raise churn, so the pilot keeps a random control group.</w:t>
+        <w:t xml:space="preserve"> Save rates are assumptions and contact can even raise churn, so the pilot keeps a random control group.</w:t>
       </w:r>
     </w:p>
     <w:p>
@@ -983,6 +1211,7 @@
       <w:r>
         <w:rPr>
           <w:b/>
+          <w:i w:val="0"/>
           <w:color w:val="0B0B0B"/>
         </w:rPr>
         <w:t>Sample data.</w:t>
@@ -990,9 +1219,10 @@
       <w:r>
         <w:rPr>
           <w:b w:val="0"/>
+          <w:i w:val="0"/>
           <w:color w:val="0B0B0B"/>
         </w:rPr>
-        <w:t xml:space="preserve"> The IBM sample describes a fictional US company with 26.5% churn; real US carriers lose about 1% of postpaid customers per month. The results show that the method works, not how big the prize is. Retrain on our own data before rollout.</w:t>
+        <w:t xml:space="preserve"> Real operators lose far fewer customers than this sample's 27%. At 15% average churn only 7% of customers would be worth this offer, so offers and contact must get cheaper (for example SMS); retrain on our own data (Vietnam deployment note).</w:t>
       </w:r>
     </w:p>
     <w:p>
@@ -1003,16 +1233,18 @@
       <w:r>
         <w:rPr>
           <w:b/>
+          <w:i w:val="0"/>
           <w:color w:val="0B0B0B"/>
         </w:rPr>
-        <w:t>Fairness and experience.</w:t>
+        <w:t>Fairness.</w:t>
       </w:r>
       <w:r>
         <w:rPr>
           <w:b w:val="0"/>
+          <w:i w:val="0"/>
           <w:color w:val="0B0B0B"/>
         </w:rPr>
-        <w:t xml:space="preserve"> Senior customers are contacted 3.7x as often as others, because they are higher-risk and pay more; age and gender are not model inputs. Loyal, low-risk customers rarely get offers, so watch for "loyalty penalty" complaints.</w:t>
+        <w:t xml:space="preserve"> Seniors are contacted 3.3x as often as others (2.6x under today's rule), 1.7x after adjusting for risk. Age and gender are not model inputs; Legal/DPO reviews each wave.</w:t>
       </w:r>
     </w:p>
     <w:p>
@@ -1023,16 +1255,18 @@
       <w:r>
         <w:rPr>
           <w:b/>
+          <w:i w:val="0"/>
           <w:color w:val="0B0B0B"/>
         </w:rPr>
-        <w:t>Compliance (Vietnam).</w:t>
+        <w:t>Compliance.</w:t>
       </w:r>
       <w:r>
         <w:rPr>
           <w:b w:val="0"/>
+          <w:i w:val="0"/>
           <w:color w:val="0B0B0B"/>
         </w:rPr>
-        <w:t xml:space="preserve"> Prior consent and a Do-Not-Call check are required. Advertising calls are limited to one per 24 hours, between 08:00 and 17:00 (Decree 91/2020). A data-protection impact assessment is required under the Personal Data Protection Law 2025.</w:t>
+        <w:t xml:space="preserve"> Consent, Do-Not-Call checks, contact limits and a data-protection impact assessment.</w:t>
       </w:r>
     </w:p>
     <w:p>
@@ -1045,45 +1279,109 @@
     </w:p>
     <w:p>
       <w:pPr>
-        <w:pStyle w:val="ListNumber"/>
+        <w:tabs>
+          <w:tab w:pos="357" w:val="left"/>
+        </w:tabs>
         <w:spacing w:after="20"/>
+        <w:ind w:left="357" w:hanging="357"/>
       </w:pPr>
       <w:r>
         <w:rPr>
           <w:b w:val="0"/>
+          <w:i w:val="0"/>
           <w:color w:val="0B0B0B"/>
         </w:rPr>
-        <w:t>Approve one pilot wave: 775 customers contacted and 775 held out. Offer and contact budget about $21,125.</w:t>
+        <w:t>1.</w:t>
+        <w:tab/>
+      </w:r>
+      <w:r>
+        <w:rPr>
+          <w:b/>
+          <w:i w:val="0"/>
+          <w:color w:val="0B0B0B"/>
+        </w:rPr>
+        <w:t>Approve one pilot wave:</w:t>
+      </w:r>
+      <w:r>
+        <w:rPr>
+          <w:b w:val="0"/>
+          <w:i w:val="0"/>
+          <w:color w:val="0B0B0B"/>
+        </w:rPr>
+        <w:t xml:space="preserve"> 810 customers offered, 810 held out; offer and contact cost about $22,875, expected net value of the offered half $10,363, worst case (no one saved) -$22,875.</w:t>
       </w:r>
     </w:p>
     <w:p>
       <w:pPr>
-        <w:pStyle w:val="ListNumber"/>
+        <w:tabs>
+          <w:tab w:pos="357" w:val="left"/>
+        </w:tabs>
         <w:spacing w:after="20"/>
+        <w:ind w:left="357" w:hanging="357"/>
       </w:pPr>
       <w:r>
         <w:rPr>
           <w:b w:val="0"/>
+          <w:i w:val="0"/>
           <w:color w:val="0B0B0B"/>
         </w:rPr>
-        <w:t>Name owners: Retention (offers and script), Call centre (capacity), Finance (margin and offer cost), Legal/DPO (consent and DPIA).</w:t>
+        <w:t>2.</w:t>
+        <w:tab/>
+      </w:r>
+      <w:r>
+        <w:rPr>
+          <w:b/>
+          <w:i w:val="0"/>
+          <w:color w:val="0B0B0B"/>
+        </w:rPr>
+        <w:t>Name owners:</w:t>
+      </w:r>
+      <w:r>
+        <w:rPr>
+          <w:b w:val="0"/>
+          <w:i w:val="0"/>
+          <w:color w:val="0B0B0B"/>
+        </w:rPr>
+        <w:t xml:space="preserve"> Retention (offers), Call centre (capacity), Finance (margin, offer cost), Legal/DPO (consent, DPIA).</w:t>
       </w:r>
     </w:p>
     <w:p>
       <w:pPr>
-        <w:pStyle w:val="ListNumber"/>
+        <w:tabs>
+          <w:tab w:pos="357" w:val="left"/>
+        </w:tabs>
         <w:spacing w:after="20"/>
+        <w:ind w:left="357" w:hanging="357"/>
       </w:pPr>
       <w:r>
         <w:rPr>
           <w:b w:val="0"/>
+          <w:i w:val="0"/>
           <w:color w:val="0B0B0B"/>
         </w:rPr>
-        <w:t xml:space="preserve">Agree the decision rule now. After 90 days: </w:t>
+        <w:t>3.</w:t>
+        <w:tab/>
       </w:r>
       <w:r>
         <w:rPr>
           <w:b/>
+          <w:i w:val="0"/>
+          <w:color w:val="0B0B0B"/>
+        </w:rPr>
+        <w:t>Agree the rule now:</w:t>
+      </w:r>
+      <w:r>
+        <w:rPr>
+          <w:b w:val="0"/>
+          <w:i w:val="0"/>
+          <w:color w:val="0B0B0B"/>
+        </w:rPr>
+        <w:t xml:space="preserve"> after 90 days, </w:t>
+      </w:r>
+      <w:r>
+        <w:rPr>
+          <w:b/>
+          <w:i w:val="0"/>
           <w:color w:val="0B0B0B"/>
         </w:rPr>
         <w:t>go</w:t>
@@ -1091,13 +1389,15 @@
       <w:r>
         <w:rPr>
           <w:b w:val="0"/>
+          <w:i w:val="0"/>
           <w:color w:val="0B0B0B"/>
         </w:rPr>
-        <w:t xml:space="preserve"> (scale to the recommended budget) if the offer effect is statistically significant and the measured save rate is at least 13.9%; </w:t>
+        <w:t xml:space="preserve"> if the effect is statistically significant and at least 13.8%; </w:t>
       </w:r>
       <w:r>
         <w:rPr>
           <w:b/>
+          <w:i w:val="0"/>
           <w:color w:val="0B0B0B"/>
         </w:rPr>
         <w:t>stop</w:t>
@@ -1105,9 +1405,10 @@
       <w:r>
         <w:rPr>
           <w:b w:val="0"/>
+          <w:i w:val="0"/>
           <w:color w:val="0B0B0B"/>
         </w:rPr>
-        <w:t xml:space="preserve"> if it is clearly below; otherwise run one more wave. If the true save rate is 20%, this rule says go 94% of the time.</w:t>
+        <w:t xml:space="preserve"> if clearly below; otherwise extend, at most 2 more waves. At a true save rate of 20% the rule says go 95% of the time. Decision about 19 weeks after approval.</w:t>
       </w:r>
     </w:p>
     <w:sectPr>

</xml_diff>